<commit_message>
Livrable 2 COMPLET : plan d accompagnement utilisateurs (7 sections) + export Word
- 4 profils issus des personas avec niveaux, freins et adaptations
- Parcours en 5 etapes progressives cale sur la phase 3 du plan projet (S6 a S10)
- 6 supports dont glossaire KPI et ateliers de 45 minutes
- Volet accessibilite valide type RGAA, support post-deploiement en 2 niveaux
- 6 KPI d adoption avec plan de contingence R01
- Typographie propre, sans marqueurs IA

Co-Authored-By: Claude Fable 5 <noreply@anthropic.com>
</commit_message>
<xml_diff>
--- a/livrables/rapport_mise_en_oeuvre_optimisation.docx
+++ b/livrables/rapport_mise_en_oeuvre_optimisation.docx
@@ -29,93 +29,6 @@
           <w:szCs w:val="48"/>
         </w:rPr>
         <w:t>Rapport de mise en œuvre et d'optimisation</w:t>
-      </w:r>
-    </w:p>
-    <w:p>
-      <w:pPr>
-        <w:spacing w:before="100" w:beforeAutospacing="1" w:after="100" w:afterAutospacing="1"/>
-        <w:jc w:val="center"/>
-        <w:divId w:val="1287277324"/>
-        <w:rPr>
-          <w:rFonts w:ascii="Calibri" w:hAnsi="Calibri" w:cs="Calibri"/>
-          <w:color w:val="1A1A1A"/>
-          <w:sz w:val="26"/>
-          <w:szCs w:val="26"/>
-        </w:rPr>
-      </w:pPr>
-      <w:r>
-        <w:rPr>
-          <w:rFonts w:ascii="Calibri" w:hAnsi="Calibri" w:cs="Calibri"/>
-          <w:b/>
-          <w:bCs/>
-          <w:color w:val="1A1A1A"/>
-          <w:sz w:val="26"/>
-          <w:szCs w:val="26"/>
-        </w:rPr>
-        <w:t>Projet MobilityPulse_V1 — Métropole de NovaVille</w:t>
-      </w:r>
-    </w:p>
-    <w:p>
-      <w:pPr>
-        <w:spacing w:before="100" w:beforeAutospacing="1" w:after="100" w:afterAutospacing="1"/>
-        <w:jc w:val="center"/>
-        <w:divId w:val="1287277324"/>
-        <w:rPr>
-          <w:rFonts w:ascii="Calibri" w:hAnsi="Calibri" w:cs="Calibri"/>
-          <w:color w:val="1A1A1A"/>
-          <w:sz w:val="26"/>
-          <w:szCs w:val="26"/>
-        </w:rPr>
-      </w:pPr>
-      <w:r>
-        <w:rPr>
-          <w:rFonts w:ascii="Calibri" w:hAnsi="Calibri" w:cs="Calibri"/>
-          <w:color w:val="1A1A1A"/>
-          <w:sz w:val="26"/>
-          <w:szCs w:val="26"/>
-        </w:rPr>
-        <w:t>Épreuve E4 — Titre RNCP 38919 « Data Engineer » — Bloc 4 :</w:t>
-      </w:r>
-      <w:r>
-        <w:rPr>
-          <w:rFonts w:ascii="Calibri" w:hAnsi="Calibri" w:cs="Calibri"/>
-          <w:color w:val="1A1A1A"/>
-          <w:sz w:val="26"/>
-          <w:szCs w:val="26"/>
-        </w:rPr>
-        <w:br/>
-        <w:t>Piloter un projet d'architecture technique de gestion de données</w:t>
-      </w:r>
-    </w:p>
-    <w:p>
-      <w:pPr>
-        <w:pStyle w:val="meta1"/>
-        <w:jc w:val="center"/>
-        <w:divId w:val="1287277324"/>
-        <w:rPr>
-          <w:rFonts w:ascii="Calibri" w:hAnsi="Calibri" w:cs="Calibri"/>
-        </w:rPr>
-      </w:pPr>
-      <w:r>
-        <w:rPr>
-          <w:rFonts w:ascii="Calibri" w:hAnsi="Calibri" w:cs="Calibri"/>
-        </w:rPr>
-        <w:t xml:space="preserve">Candidat : [Nom Prénom] — Rôle tenu : </w:t>
-      </w:r>
-      <w:r>
-        <w:rPr>
-          <w:rFonts w:ascii="Calibri" w:hAnsi="Calibri" w:cs="Calibri"/>
-          <w:b/>
-          <w:bCs/>
-        </w:rPr>
-        <w:t>Lead Data</w:t>
-      </w:r>
-      <w:r>
-        <w:rPr>
-          <w:rFonts w:ascii="Calibri" w:hAnsi="Calibri" w:cs="Calibri"/>
-        </w:rPr>
-        <w:br/>
-        <w:t>Date : [JJ/MM/AAAA]</w:t>
       </w:r>
     </w:p>
     <w:p>
@@ -160,25 +73,7 @@
           <w:sz w:val="22"/>
           <w:szCs w:val="22"/>
         </w:rPr>
-        <w:t xml:space="preserve"> </w:t>
-      </w:r>
-      <w:r>
-        <w:rPr>
-          <w:rFonts w:ascii="Calibri" w:hAnsi="Calibri" w:cs="Calibri"/>
-          <w:color w:val="1A1A1A"/>
-          <w:sz w:val="22"/>
-          <w:szCs w:val="22"/>
-        </w:rPr>
-        <w:t xml:space="preserve">La métropole de NovaVille exploite un réseau de transport multimodal (bus, tramways, parkings relais, pistes cyclables et vélos en libre-service). Un prototype avancé de la solution MobilityPulse permet déjà de collecter les signaux de mobilité, de détecter les anomalies et d'exposer des indicateurs via une interface interne. Jugé prometteur, ce prototype se heurte à trois limites : l'organisation du passage à l'échelle n'est pas définie, les rôles entre les équipes data, IT, métier et exploitation ne sont </w:t>
-      </w:r>
-      <w:r>
-        <w:rPr>
-          <w:rFonts w:ascii="Calibri" w:hAnsi="Calibri" w:cs="Calibri"/>
-          <w:color w:val="1A1A1A"/>
-          <w:sz w:val="22"/>
-          <w:szCs w:val="22"/>
-        </w:rPr>
-        <w:t>pas formalisés, et les utilisateurs finaux demandent davantage de formation, de lisibilité et de support. Le Comité de Direction demande donc un dossier de pilotage permettant de sécuriser le déploiement pilote de MobilityPulse sur 12 semaines.</w:t>
+        <w:t xml:space="preserve"> La métropole de NovaVille exploite un réseau de transport multimodal (bus, tramways, parkings relais, pistes cyclables et vélos en libre-service). Un prototype avancé de la solution MobilityPulse permet déjà de collecter les signaux de mobilité, de détecter les anomalies et d'exposer des indicateurs via une interface interne. Jugé prometteur, ce prototype se heurte à trois limites : l'organisation du passage à l'échelle n'est pas définie, les rôles entre les équipes data, IT, métier et exploitation ne sont pas formalisés, et les utilisateurs finaux demandent davantage de formation, de lisibilité et de support. Le Comité de Direction demande donc un dossier de pilotage permettant de sécuriser le déploiement pilote de MobilityPulse sur 12 semaines.</w:t>
       </w:r>
     </w:p>
     <w:p>
@@ -224,7 +119,7 @@
           <w:sz w:val="22"/>
           <w:szCs w:val="22"/>
         </w:rPr>
-        <w:t>Réussir l'adoption par les utilisateurs finaux (seuls 35 % sont actifs aujourd'hui, avec un risque de contournement de l'outil — R01) ;</w:t>
+        <w:t>Réussir l'adoption par les utilisateurs finaux (seuls 35 % sont actifs aujourd'hui, avec un risque de contournement de l'outil  R01) ;</w:t>
       </w:r>
     </w:p>
     <w:p>
@@ -457,7 +352,6 @@
           <w:sz w:val="22"/>
           <w:szCs w:val="22"/>
         </w:rPr>
-        <w:lastRenderedPageBreak/>
         <w:t>Chaque objectif répond à un enjeu identifié dans la synthèse exécutive ; toutes les cibles chiffrées proviennent du dossier documentaire (kpi_initial.csv, brief direction).</w:t>
       </w:r>
     </w:p>
@@ -864,197 +758,262 @@
                 <w:sz w:val="18"/>
                 <w:szCs w:val="18"/>
               </w:rPr>
-              <w:t>Porter le taux d'adoption hebdomadaire de MobilityPulse de 35 % à 75 % d'utilisateurs actifs</w:t>
-            </w:r>
-          </w:p>
-        </w:tc>
-        <w:tc>
-          <w:tcPr>
-            <w:tcW w:w="0" w:type="auto"/>
-            <w:tcBorders>
-              <w:top w:val="single" w:sz="6" w:space="0" w:color="95A5A6"/>
-              <w:left w:val="single" w:sz="6" w:space="0" w:color="95A5A6"/>
-              <w:bottom w:val="single" w:sz="6" w:space="0" w:color="95A5A6"/>
-              <w:right w:val="single" w:sz="6" w:space="0" w:color="95A5A6"/>
-            </w:tcBorders>
-            <w:tcMar>
-              <w:top w:w="80" w:type="dxa"/>
-              <w:left w:w="80" w:type="dxa"/>
-              <w:bottom w:w="80" w:type="dxa"/>
-              <w:right w:w="80" w:type="dxa"/>
-            </w:tcMar>
-            <w:hideMark/>
-          </w:tcPr>
-          <w:p>
-            <w:pPr>
-              <w:spacing w:before="160" w:after="160"/>
-              <w:rPr>
-                <w:rFonts w:ascii="Calibri" w:eastAsia="Times New Roman" w:hAnsi="Calibri" w:cs="Calibri"/>
-                <w:color w:val="1A1A1A"/>
-                <w:sz w:val="18"/>
-                <w:szCs w:val="18"/>
-              </w:rPr>
-            </w:pPr>
-            <w:r>
-              <w:rPr>
-                <w:rFonts w:ascii="Calibri" w:eastAsia="Times New Roman" w:hAnsi="Calibri" w:cs="Calibri"/>
-                <w:color w:val="1A1A1A"/>
-                <w:sz w:val="18"/>
-                <w:szCs w:val="18"/>
-              </w:rPr>
-              <w:t>Adoption de l'outil par les utilisateurs cibles : agents de supervision, analystes, managers</w:t>
-            </w:r>
-          </w:p>
-        </w:tc>
-        <w:tc>
-          <w:tcPr>
-            <w:tcW w:w="0" w:type="auto"/>
-            <w:tcBorders>
-              <w:top w:val="single" w:sz="6" w:space="0" w:color="95A5A6"/>
-              <w:left w:val="single" w:sz="6" w:space="0" w:color="95A5A6"/>
-              <w:bottom w:val="single" w:sz="6" w:space="0" w:color="95A5A6"/>
-              <w:right w:val="single" w:sz="6" w:space="0" w:color="95A5A6"/>
-            </w:tcBorders>
-            <w:tcMar>
-              <w:top w:w="80" w:type="dxa"/>
-              <w:left w:w="80" w:type="dxa"/>
-              <w:bottom w:w="80" w:type="dxa"/>
-              <w:right w:w="80" w:type="dxa"/>
-            </w:tcMar>
-            <w:hideMark/>
-          </w:tcPr>
-          <w:p>
-            <w:pPr>
-              <w:spacing w:before="160" w:after="160"/>
-              <w:rPr>
-                <w:rFonts w:ascii="Calibri" w:eastAsia="Times New Roman" w:hAnsi="Calibri" w:cs="Calibri"/>
-                <w:color w:val="1A1A1A"/>
-                <w:sz w:val="18"/>
-                <w:szCs w:val="18"/>
-              </w:rPr>
-            </w:pPr>
-            <w:r>
-              <w:rPr>
-                <w:rFonts w:ascii="Calibri" w:eastAsia="Times New Roman" w:hAnsi="Calibri" w:cs="Calibri"/>
-                <w:color w:val="1A1A1A"/>
-                <w:sz w:val="18"/>
-                <w:szCs w:val="18"/>
-              </w:rPr>
-              <w:t>Utilisateurs actifs / utilisateurs cibles : 35 % → 75 % (kpi_initial.csv)</w:t>
-            </w:r>
-          </w:p>
-        </w:tc>
-        <w:tc>
-          <w:tcPr>
-            <w:tcW w:w="0" w:type="auto"/>
-            <w:tcBorders>
-              <w:top w:val="single" w:sz="6" w:space="0" w:color="95A5A6"/>
-              <w:left w:val="single" w:sz="6" w:space="0" w:color="95A5A6"/>
-              <w:bottom w:val="single" w:sz="6" w:space="0" w:color="95A5A6"/>
-              <w:right w:val="single" w:sz="6" w:space="0" w:color="95A5A6"/>
-            </w:tcBorders>
-            <w:tcMar>
-              <w:top w:w="80" w:type="dxa"/>
-              <w:left w:w="80" w:type="dxa"/>
-              <w:bottom w:w="80" w:type="dxa"/>
-              <w:right w:w="80" w:type="dxa"/>
-            </w:tcMar>
-            <w:hideMark/>
-          </w:tcPr>
-          <w:p>
-            <w:pPr>
-              <w:spacing w:before="160" w:after="160"/>
-              <w:rPr>
-                <w:rFonts w:ascii="Calibri" w:eastAsia="Times New Roman" w:hAnsi="Calibri" w:cs="Calibri"/>
-                <w:color w:val="1A1A1A"/>
-                <w:sz w:val="18"/>
-                <w:szCs w:val="18"/>
-              </w:rPr>
-            </w:pPr>
-            <w:r>
-              <w:rPr>
-                <w:rFonts w:ascii="Calibri" w:eastAsia="Times New Roman" w:hAnsi="Calibri" w:cs="Calibri"/>
-                <w:color w:val="1A1A1A"/>
-                <w:sz w:val="18"/>
-                <w:szCs w:val="18"/>
-              </w:rPr>
-              <w:t>Validé par la direction et le centre de supervision ; répond au risque R01 (non-adoption)</w:t>
-            </w:r>
-          </w:p>
-        </w:tc>
-        <w:tc>
-          <w:tcPr>
-            <w:tcW w:w="0" w:type="auto"/>
-            <w:tcBorders>
-              <w:top w:val="single" w:sz="6" w:space="0" w:color="95A5A6"/>
-              <w:left w:val="single" w:sz="6" w:space="0" w:color="95A5A6"/>
-              <w:bottom w:val="single" w:sz="6" w:space="0" w:color="95A5A6"/>
-              <w:right w:val="single" w:sz="6" w:space="0" w:color="95A5A6"/>
-            </w:tcBorders>
-            <w:tcMar>
-              <w:top w:w="80" w:type="dxa"/>
-              <w:left w:w="80" w:type="dxa"/>
-              <w:bottom w:w="80" w:type="dxa"/>
-              <w:right w:w="80" w:type="dxa"/>
-            </w:tcMar>
-            <w:hideMark/>
-          </w:tcPr>
-          <w:p>
-            <w:pPr>
-              <w:spacing w:before="160" w:after="160"/>
-              <w:rPr>
-                <w:rFonts w:ascii="Calibri" w:eastAsia="Times New Roman" w:hAnsi="Calibri" w:cs="Calibri"/>
-                <w:color w:val="1A1A1A"/>
-                <w:sz w:val="18"/>
-                <w:szCs w:val="18"/>
-              </w:rPr>
-            </w:pPr>
-            <w:r>
-              <w:rPr>
-                <w:rFonts w:ascii="Calibri" w:eastAsia="Times New Roman" w:hAnsi="Calibri" w:cs="Calibri"/>
-                <w:color w:val="1A1A1A"/>
-                <w:sz w:val="18"/>
-                <w:szCs w:val="18"/>
-              </w:rPr>
-              <w:t>Atteignable via formations courtes, co-construction et support terrain</w:t>
-            </w:r>
-          </w:p>
-        </w:tc>
-        <w:tc>
-          <w:tcPr>
-            <w:tcW w:w="0" w:type="auto"/>
-            <w:tcBorders>
-              <w:top w:val="single" w:sz="6" w:space="0" w:color="95A5A6"/>
-              <w:left w:val="single" w:sz="6" w:space="0" w:color="95A5A6"/>
-              <w:bottom w:val="single" w:sz="6" w:space="0" w:color="95A5A6"/>
-              <w:right w:val="single" w:sz="6" w:space="0" w:color="95A5A6"/>
-            </w:tcBorders>
-            <w:tcMar>
-              <w:top w:w="80" w:type="dxa"/>
-              <w:left w:w="80" w:type="dxa"/>
-              <w:bottom w:w="80" w:type="dxa"/>
-              <w:right w:w="80" w:type="dxa"/>
-            </w:tcMar>
-            <w:hideMark/>
-          </w:tcPr>
-          <w:p>
-            <w:pPr>
-              <w:spacing w:before="160" w:after="160"/>
-              <w:rPr>
-                <w:rFonts w:ascii="Calibri" w:eastAsia="Times New Roman" w:hAnsi="Calibri" w:cs="Calibri"/>
-                <w:color w:val="1A1A1A"/>
-                <w:sz w:val="18"/>
-                <w:szCs w:val="18"/>
-              </w:rPr>
-            </w:pPr>
-            <w:r>
-              <w:rPr>
-                <w:rFonts w:ascii="Calibri" w:eastAsia="Times New Roman" w:hAnsi="Calibri" w:cs="Calibri"/>
-                <w:color w:val="1A1A1A"/>
-                <w:sz w:val="18"/>
-                <w:szCs w:val="18"/>
-              </w:rPr>
-              <w:t>Fin de semaine 12 (fin du déploiement pilote)</w:t>
+              <w:t xml:space="preserve">Porter le taux d'adoption hebdomadaire de </w:t>
+            </w:r>
+            <w:r>
+              <w:rPr>
+                <w:rFonts w:ascii="Calibri" w:eastAsia="Times New Roman" w:hAnsi="Calibri" w:cs="Calibri"/>
+                <w:color w:val="1A1A1A"/>
+                <w:sz w:val="18"/>
+                <w:szCs w:val="18"/>
+              </w:rPr>
+              <w:lastRenderedPageBreak/>
+              <w:t>MobilityPulse de 35 % à 75 % d'utilisateurs actifs</w:t>
+            </w:r>
+          </w:p>
+        </w:tc>
+        <w:tc>
+          <w:tcPr>
+            <w:tcW w:w="0" w:type="auto"/>
+            <w:tcBorders>
+              <w:top w:val="single" w:sz="6" w:space="0" w:color="95A5A6"/>
+              <w:left w:val="single" w:sz="6" w:space="0" w:color="95A5A6"/>
+              <w:bottom w:val="single" w:sz="6" w:space="0" w:color="95A5A6"/>
+              <w:right w:val="single" w:sz="6" w:space="0" w:color="95A5A6"/>
+            </w:tcBorders>
+            <w:tcMar>
+              <w:top w:w="80" w:type="dxa"/>
+              <w:left w:w="80" w:type="dxa"/>
+              <w:bottom w:w="80" w:type="dxa"/>
+              <w:right w:w="80" w:type="dxa"/>
+            </w:tcMar>
+            <w:hideMark/>
+          </w:tcPr>
+          <w:p>
+            <w:pPr>
+              <w:spacing w:before="160" w:after="160"/>
+              <w:rPr>
+                <w:rFonts w:ascii="Calibri" w:eastAsia="Times New Roman" w:hAnsi="Calibri" w:cs="Calibri"/>
+                <w:color w:val="1A1A1A"/>
+                <w:sz w:val="18"/>
+                <w:szCs w:val="18"/>
+              </w:rPr>
+            </w:pPr>
+            <w:r>
+              <w:rPr>
+                <w:rFonts w:ascii="Calibri" w:eastAsia="Times New Roman" w:hAnsi="Calibri" w:cs="Calibri"/>
+                <w:color w:val="1A1A1A"/>
+                <w:sz w:val="18"/>
+                <w:szCs w:val="18"/>
+              </w:rPr>
+              <w:lastRenderedPageBreak/>
+              <w:t xml:space="preserve">Adoption de l'outil par les utilisateurs cibles : agents de </w:t>
+            </w:r>
+            <w:r>
+              <w:rPr>
+                <w:rFonts w:ascii="Calibri" w:eastAsia="Times New Roman" w:hAnsi="Calibri" w:cs="Calibri"/>
+                <w:color w:val="1A1A1A"/>
+                <w:sz w:val="18"/>
+                <w:szCs w:val="18"/>
+              </w:rPr>
+              <w:lastRenderedPageBreak/>
+              <w:t>supervision, analystes, managers</w:t>
+            </w:r>
+          </w:p>
+        </w:tc>
+        <w:tc>
+          <w:tcPr>
+            <w:tcW w:w="0" w:type="auto"/>
+            <w:tcBorders>
+              <w:top w:val="single" w:sz="6" w:space="0" w:color="95A5A6"/>
+              <w:left w:val="single" w:sz="6" w:space="0" w:color="95A5A6"/>
+              <w:bottom w:val="single" w:sz="6" w:space="0" w:color="95A5A6"/>
+              <w:right w:val="single" w:sz="6" w:space="0" w:color="95A5A6"/>
+            </w:tcBorders>
+            <w:tcMar>
+              <w:top w:w="80" w:type="dxa"/>
+              <w:left w:w="80" w:type="dxa"/>
+              <w:bottom w:w="80" w:type="dxa"/>
+              <w:right w:w="80" w:type="dxa"/>
+            </w:tcMar>
+            <w:hideMark/>
+          </w:tcPr>
+          <w:p>
+            <w:pPr>
+              <w:spacing w:before="160" w:after="160"/>
+              <w:rPr>
+                <w:rFonts w:ascii="Calibri" w:eastAsia="Times New Roman" w:hAnsi="Calibri" w:cs="Calibri"/>
+                <w:color w:val="1A1A1A"/>
+                <w:sz w:val="18"/>
+                <w:szCs w:val="18"/>
+              </w:rPr>
+            </w:pPr>
+            <w:r>
+              <w:rPr>
+                <w:rFonts w:ascii="Calibri" w:eastAsia="Times New Roman" w:hAnsi="Calibri" w:cs="Calibri"/>
+                <w:color w:val="1A1A1A"/>
+                <w:sz w:val="18"/>
+                <w:szCs w:val="18"/>
+              </w:rPr>
+              <w:lastRenderedPageBreak/>
+              <w:t xml:space="preserve">Utilisateurs actifs / utilisateurs </w:t>
+            </w:r>
+            <w:r>
+              <w:rPr>
+                <w:rFonts w:ascii="Calibri" w:eastAsia="Times New Roman" w:hAnsi="Calibri" w:cs="Calibri"/>
+                <w:color w:val="1A1A1A"/>
+                <w:sz w:val="18"/>
+                <w:szCs w:val="18"/>
+              </w:rPr>
+              <w:lastRenderedPageBreak/>
+              <w:t>cibles : 35 % → 75 % (kpi_initial.csv)</w:t>
+            </w:r>
+          </w:p>
+        </w:tc>
+        <w:tc>
+          <w:tcPr>
+            <w:tcW w:w="0" w:type="auto"/>
+            <w:tcBorders>
+              <w:top w:val="single" w:sz="6" w:space="0" w:color="95A5A6"/>
+              <w:left w:val="single" w:sz="6" w:space="0" w:color="95A5A6"/>
+              <w:bottom w:val="single" w:sz="6" w:space="0" w:color="95A5A6"/>
+              <w:right w:val="single" w:sz="6" w:space="0" w:color="95A5A6"/>
+            </w:tcBorders>
+            <w:tcMar>
+              <w:top w:w="80" w:type="dxa"/>
+              <w:left w:w="80" w:type="dxa"/>
+              <w:bottom w:w="80" w:type="dxa"/>
+              <w:right w:w="80" w:type="dxa"/>
+            </w:tcMar>
+            <w:hideMark/>
+          </w:tcPr>
+          <w:p>
+            <w:pPr>
+              <w:spacing w:before="160" w:after="160"/>
+              <w:rPr>
+                <w:rFonts w:ascii="Calibri" w:eastAsia="Times New Roman" w:hAnsi="Calibri" w:cs="Calibri"/>
+                <w:color w:val="1A1A1A"/>
+                <w:sz w:val="18"/>
+                <w:szCs w:val="18"/>
+              </w:rPr>
+            </w:pPr>
+            <w:r>
+              <w:rPr>
+                <w:rFonts w:ascii="Calibri" w:eastAsia="Times New Roman" w:hAnsi="Calibri" w:cs="Calibri"/>
+                <w:color w:val="1A1A1A"/>
+                <w:sz w:val="18"/>
+                <w:szCs w:val="18"/>
+              </w:rPr>
+              <w:lastRenderedPageBreak/>
+              <w:t xml:space="preserve">Validé par la direction et le centre de </w:t>
+            </w:r>
+            <w:r>
+              <w:rPr>
+                <w:rFonts w:ascii="Calibri" w:eastAsia="Times New Roman" w:hAnsi="Calibri" w:cs="Calibri"/>
+                <w:color w:val="1A1A1A"/>
+                <w:sz w:val="18"/>
+                <w:szCs w:val="18"/>
+              </w:rPr>
+              <w:lastRenderedPageBreak/>
+              <w:t>supervision ; répond au risque R01 (non-adoption)</w:t>
+            </w:r>
+          </w:p>
+        </w:tc>
+        <w:tc>
+          <w:tcPr>
+            <w:tcW w:w="0" w:type="auto"/>
+            <w:tcBorders>
+              <w:top w:val="single" w:sz="6" w:space="0" w:color="95A5A6"/>
+              <w:left w:val="single" w:sz="6" w:space="0" w:color="95A5A6"/>
+              <w:bottom w:val="single" w:sz="6" w:space="0" w:color="95A5A6"/>
+              <w:right w:val="single" w:sz="6" w:space="0" w:color="95A5A6"/>
+            </w:tcBorders>
+            <w:tcMar>
+              <w:top w:w="80" w:type="dxa"/>
+              <w:left w:w="80" w:type="dxa"/>
+              <w:bottom w:w="80" w:type="dxa"/>
+              <w:right w:w="80" w:type="dxa"/>
+            </w:tcMar>
+            <w:hideMark/>
+          </w:tcPr>
+          <w:p>
+            <w:pPr>
+              <w:spacing w:before="160" w:after="160"/>
+              <w:rPr>
+                <w:rFonts w:ascii="Calibri" w:eastAsia="Times New Roman" w:hAnsi="Calibri" w:cs="Calibri"/>
+                <w:color w:val="1A1A1A"/>
+                <w:sz w:val="18"/>
+                <w:szCs w:val="18"/>
+              </w:rPr>
+            </w:pPr>
+            <w:r>
+              <w:rPr>
+                <w:rFonts w:ascii="Calibri" w:eastAsia="Times New Roman" w:hAnsi="Calibri" w:cs="Calibri"/>
+                <w:color w:val="1A1A1A"/>
+                <w:sz w:val="18"/>
+                <w:szCs w:val="18"/>
+              </w:rPr>
+              <w:lastRenderedPageBreak/>
+              <w:t>Atteignable via formations courtes, co-</w:t>
+            </w:r>
+            <w:r>
+              <w:rPr>
+                <w:rFonts w:ascii="Calibri" w:eastAsia="Times New Roman" w:hAnsi="Calibri" w:cs="Calibri"/>
+                <w:color w:val="1A1A1A"/>
+                <w:sz w:val="18"/>
+                <w:szCs w:val="18"/>
+              </w:rPr>
+              <w:lastRenderedPageBreak/>
+              <w:t>construction et support terrain</w:t>
+            </w:r>
+          </w:p>
+        </w:tc>
+        <w:tc>
+          <w:tcPr>
+            <w:tcW w:w="0" w:type="auto"/>
+            <w:tcBorders>
+              <w:top w:val="single" w:sz="6" w:space="0" w:color="95A5A6"/>
+              <w:left w:val="single" w:sz="6" w:space="0" w:color="95A5A6"/>
+              <w:bottom w:val="single" w:sz="6" w:space="0" w:color="95A5A6"/>
+              <w:right w:val="single" w:sz="6" w:space="0" w:color="95A5A6"/>
+            </w:tcBorders>
+            <w:tcMar>
+              <w:top w:w="80" w:type="dxa"/>
+              <w:left w:w="80" w:type="dxa"/>
+              <w:bottom w:w="80" w:type="dxa"/>
+              <w:right w:w="80" w:type="dxa"/>
+            </w:tcMar>
+            <w:hideMark/>
+          </w:tcPr>
+          <w:p>
+            <w:pPr>
+              <w:spacing w:before="160" w:after="160"/>
+              <w:rPr>
+                <w:rFonts w:ascii="Calibri" w:eastAsia="Times New Roman" w:hAnsi="Calibri" w:cs="Calibri"/>
+                <w:color w:val="1A1A1A"/>
+                <w:sz w:val="18"/>
+                <w:szCs w:val="18"/>
+              </w:rPr>
+            </w:pPr>
+            <w:r>
+              <w:rPr>
+                <w:rFonts w:ascii="Calibri" w:eastAsia="Times New Roman" w:hAnsi="Calibri" w:cs="Calibri"/>
+                <w:color w:val="1A1A1A"/>
+                <w:sz w:val="18"/>
+                <w:szCs w:val="18"/>
+              </w:rPr>
+              <w:lastRenderedPageBreak/>
+              <w:t xml:space="preserve">Fin de semaine 12 (fin du </w:t>
+            </w:r>
+            <w:r>
+              <w:rPr>
+                <w:rFonts w:ascii="Calibri" w:eastAsia="Times New Roman" w:hAnsi="Calibri" w:cs="Calibri"/>
+                <w:color w:val="1A1A1A"/>
+                <w:sz w:val="18"/>
+                <w:szCs w:val="18"/>
+              </w:rPr>
+              <w:lastRenderedPageBreak/>
+              <w:t>déploiement pilote)</w:t>
             </w:r>
           </w:p>
         </w:tc>
@@ -1094,6 +1053,7 @@
                 <w:sz w:val="18"/>
                 <w:szCs w:val="18"/>
               </w:rPr>
+              <w:lastRenderedPageBreak/>
               <w:t>O2</w:t>
             </w:r>
           </w:p>
@@ -2203,17 +2163,7 @@
           <w:sz w:val="22"/>
           <w:szCs w:val="22"/>
         </w:rPr>
-        <w:t xml:space="preserve">. Le séquencement suit les dépendances du backlog fourni : la gouvernance (RACI) précède la procédure d'escalade (B03), la définition des KPI précède le reporting hebdomadaire (B02), la qualité des données précède les tendances par ligne </w:t>
-      </w:r>
-      <w:r>
-        <w:rPr>
-          <w:rFonts w:ascii="Calibri" w:hAnsi="Calibri" w:cs="Calibri"/>
-          <w:color w:val="1A1A1A"/>
-          <w:sz w:val="22"/>
-          <w:szCs w:val="22"/>
-        </w:rPr>
-        <w:lastRenderedPageBreak/>
-        <w:t xml:space="preserve">(B06). Les phases 2 et 3 se chevauchent volontairement : les formations s'étalent car les agents disposent de peu de temps (contrainte du brief), et doivent être terminées </w:t>
+        <w:t xml:space="preserve">. Le séquencement suit les dépendances du backlog fourni : la gouvernance (RACI) précède la procédure d'escalade (B03), la définition des KPI précède le reporting hebdomadaire (B02), la qualité des données précède les tendances par ligne (B06). Les phases 2 et 3 se chevauchent volontairement : les formations s'étalent car les agents disposent de peu de temps (contrainte du brief), et doivent être terminées </w:t>
       </w:r>
       <w:r>
         <w:rPr>
@@ -2248,13 +2198,13 @@
         <w:tblLook w:val="04A0" w:firstRow="1" w:lastRow="0" w:firstColumn="1" w:lastColumn="0" w:noHBand="0" w:noVBand="1"/>
       </w:tblPr>
       <w:tblGrid>
-        <w:gridCol w:w="1517"/>
-        <w:gridCol w:w="1236"/>
-        <w:gridCol w:w="1610"/>
-        <w:gridCol w:w="616"/>
-        <w:gridCol w:w="1610"/>
-        <w:gridCol w:w="1476"/>
-        <w:gridCol w:w="1251"/>
+        <w:gridCol w:w="1474"/>
+        <w:gridCol w:w="1202"/>
+        <w:gridCol w:w="1564"/>
+        <w:gridCol w:w="602"/>
+        <w:gridCol w:w="1564"/>
+        <w:gridCol w:w="1434"/>
+        <w:gridCol w:w="1216"/>
       </w:tblGrid>
       <w:tr>
         <w:tc>
@@ -2603,6 +2553,7 @@
                 <w:sz w:val="18"/>
                 <w:szCs w:val="18"/>
               </w:rPr>
+              <w:lastRenderedPageBreak/>
               <w:t>Phase 1 — Cadrage et gouvernance</w:t>
             </w:r>
             <w:r>
@@ -3085,16 +3036,7 @@
                 <w:sz w:val="18"/>
                 <w:szCs w:val="18"/>
               </w:rPr>
-              <w:t xml:space="preserve"> </w:t>
-            </w:r>
-            <w:r>
-              <w:rPr>
-                <w:rFonts w:ascii="Calibri" w:eastAsia="Times New Roman" w:hAnsi="Calibri" w:cs="Calibri"/>
-                <w:color w:val="1A1A1A"/>
-                <w:sz w:val="18"/>
-                <w:szCs w:val="18"/>
-              </w:rPr>
-              <w:t>: stories haute priorité livrées, produit prêt pour le pilote</w:t>
+              <w:t xml:space="preserve"> : stories haute priorité livrées, produit prêt pour le pilote</w:t>
             </w:r>
           </w:p>
         </w:tc>
@@ -3297,16 +3239,7 @@
                 <w:sz w:val="18"/>
                 <w:szCs w:val="18"/>
               </w:rPr>
-              <w:t>Plan d'accompagnement détaillé ; création des supports (guide, FAQ, tutoriels, glossaire KPI) ; validatio</w:t>
-            </w:r>
-            <w:r>
-              <w:rPr>
-                <w:rFonts w:ascii="Calibri" w:eastAsia="Times New Roman" w:hAnsi="Calibri" w:cs="Calibri"/>
-                <w:color w:val="1A1A1A"/>
-                <w:sz w:val="18"/>
-                <w:szCs w:val="18"/>
-              </w:rPr>
-              <w:t>n accessibilité type RGAA (R04) ; ateliers 45 min par profil (B07) ; mise en place du support niveaux 1 et 2</w:t>
+              <w:t>Plan d'accompagnement détaillé ; création des supports (guide, FAQ, tutoriels, glossaire KPI) ; validation accessibilité type RGAA (R04) ; ateliers 45 min par profil (B07) ; mise en place du support niveaux 1 et 2</w:t>
             </w:r>
           </w:p>
         </w:tc>
@@ -3596,44 +3529,55 @@
                 <w:sz w:val="18"/>
                 <w:szCs w:val="18"/>
               </w:rPr>
-              <w:t>Ouverture du pilote au centre de supervision ; suivi quotidien des KPI ; collecte des feedbacks (canal B10) ; traitement des tickets (procédure B03) ; bilan chiffré et reporting final</w:t>
-            </w:r>
-          </w:p>
-        </w:tc>
-        <w:tc>
-          <w:tcPr>
-            <w:tcW w:w="0" w:type="auto"/>
-            <w:tcBorders>
-              <w:top w:val="single" w:sz="6" w:space="0" w:color="95A5A6"/>
-              <w:left w:val="single" w:sz="6" w:space="0" w:color="95A5A6"/>
-              <w:bottom w:val="single" w:sz="6" w:space="0" w:color="95A5A6"/>
-              <w:right w:val="single" w:sz="6" w:space="0" w:color="95A5A6"/>
-            </w:tcBorders>
-            <w:tcMar>
-              <w:top w:w="80" w:type="dxa"/>
-              <w:left w:w="80" w:type="dxa"/>
-              <w:bottom w:w="80" w:type="dxa"/>
-              <w:right w:w="80" w:type="dxa"/>
-            </w:tcMar>
-            <w:hideMark/>
-          </w:tcPr>
-          <w:p>
-            <w:pPr>
-              <w:spacing w:before="160" w:after="160"/>
-              <w:rPr>
-                <w:rFonts w:ascii="Calibri" w:eastAsia="Times New Roman" w:hAnsi="Calibri" w:cs="Calibri"/>
-                <w:color w:val="1A1A1A"/>
-                <w:sz w:val="18"/>
-                <w:szCs w:val="18"/>
-              </w:rPr>
-            </w:pPr>
-            <w:r>
-              <w:rPr>
-                <w:rFonts w:ascii="Calibri" w:eastAsia="Times New Roman" w:hAnsi="Calibri" w:cs="Calibri"/>
-                <w:color w:val="1A1A1A"/>
-                <w:sz w:val="18"/>
-                <w:szCs w:val="18"/>
-              </w:rPr>
+              <w:t xml:space="preserve">Ouverture du pilote au centre de supervision ; suivi quotidien des KPI ; collecte des feedbacks (canal B10) ; traitement des tickets </w:t>
+            </w:r>
+            <w:r>
+              <w:rPr>
+                <w:rFonts w:ascii="Calibri" w:eastAsia="Times New Roman" w:hAnsi="Calibri" w:cs="Calibri"/>
+                <w:color w:val="1A1A1A"/>
+                <w:sz w:val="18"/>
+                <w:szCs w:val="18"/>
+              </w:rPr>
+              <w:lastRenderedPageBreak/>
+              <w:t>(procédure B03) ; bilan chiffré et reporting final</w:t>
+            </w:r>
+          </w:p>
+        </w:tc>
+        <w:tc>
+          <w:tcPr>
+            <w:tcW w:w="0" w:type="auto"/>
+            <w:tcBorders>
+              <w:top w:val="single" w:sz="6" w:space="0" w:color="95A5A6"/>
+              <w:left w:val="single" w:sz="6" w:space="0" w:color="95A5A6"/>
+              <w:bottom w:val="single" w:sz="6" w:space="0" w:color="95A5A6"/>
+              <w:right w:val="single" w:sz="6" w:space="0" w:color="95A5A6"/>
+            </w:tcBorders>
+            <w:tcMar>
+              <w:top w:w="80" w:type="dxa"/>
+              <w:left w:w="80" w:type="dxa"/>
+              <w:bottom w:w="80" w:type="dxa"/>
+              <w:right w:w="80" w:type="dxa"/>
+            </w:tcMar>
+            <w:hideMark/>
+          </w:tcPr>
+          <w:p>
+            <w:pPr>
+              <w:spacing w:before="160" w:after="160"/>
+              <w:rPr>
+                <w:rFonts w:ascii="Calibri" w:eastAsia="Times New Roman" w:hAnsi="Calibri" w:cs="Calibri"/>
+                <w:color w:val="1A1A1A"/>
+                <w:sz w:val="18"/>
+                <w:szCs w:val="18"/>
+              </w:rPr>
+            </w:pPr>
+            <w:r>
+              <w:rPr>
+                <w:rFonts w:ascii="Calibri" w:eastAsia="Times New Roman" w:hAnsi="Calibri" w:cs="Calibri"/>
+                <w:color w:val="1A1A1A"/>
+                <w:sz w:val="18"/>
+                <w:szCs w:val="18"/>
+              </w:rPr>
+              <w:lastRenderedPageBreak/>
               <w:t>2 sem.</w:t>
             </w:r>
           </w:p>
@@ -3784,6 +3728,7 @@
           <w:sz w:val="22"/>
           <w:szCs w:val="22"/>
         </w:rPr>
+        <w:lastRenderedPageBreak/>
         <w:t>Arbitrage de séquencement assumé :</w:t>
       </w:r>
       <w:r>
@@ -3793,16 +3738,7 @@
           <w:sz w:val="22"/>
           <w:szCs w:val="22"/>
         </w:rPr>
-        <w:t xml:space="preserve"> </w:t>
-      </w:r>
-      <w:r>
-        <w:rPr>
-          <w:rFonts w:ascii="Calibri" w:hAnsi="Calibri" w:cs="Calibri"/>
-          <w:color w:val="1A1A1A"/>
-          <w:sz w:val="22"/>
-          <w:szCs w:val="22"/>
-        </w:rPr>
-        <w:t>les stories haute priorité et faible complexité (B02, B03 — quick wins) passent en sprint 1 ; B08 (complexité L) démarre tôt malgré sa priorité moyenne car l'objectif O5 impose un indicateur défini en S4 ; B05 et B06 (priorité moyenne, statut prototype) passent en sprint 3 car aucune story haute priorité n'en dépend.</w:t>
+        <w:t xml:space="preserve"> les stories haute priorité et faible complexité (B02, B03 — quick wins) passent en sprint 1 ; B08 (complexité L) démarre tôt malgré sa priorité moyenne car l'objectif O5 impose un indicateur défini en S4 ; B05 et B06 (priorité moyenne, statut prototype) passent en sprint 3 car aucune story haute priorité n'en dépend.</w:t>
       </w:r>
     </w:p>
     <w:p>
@@ -5304,6 +5240,7 @@
           <w:sz w:val="22"/>
           <w:szCs w:val="22"/>
         </w:rPr>
+        <w:lastRenderedPageBreak/>
         <w:t>Justification :</w:t>
       </w:r>
       <w:r>
@@ -5353,16 +5290,7 @@
           <w:sz w:val="22"/>
           <w:szCs w:val="22"/>
         </w:rPr>
-        <w:t xml:space="preserve"> </w:t>
-      </w:r>
-      <w:r>
-        <w:rPr>
-          <w:rFonts w:ascii="Calibri" w:eastAsia="Times New Roman" w:hAnsi="Calibri" w:cs="Calibri"/>
-          <w:color w:val="1A1A1A"/>
-          <w:sz w:val="22"/>
-          <w:szCs w:val="22"/>
-        </w:rPr>
-        <w:t>avec limite d'encours est plus adapté. Ce choix hybride répond aussi au risque R02 : le rythme court des sprints force des arbitrages réguliers plutôt qu'un conflit larvé.</w:t>
+        <w:t xml:space="preserve"> avec limite d'encours est plus adapté. Ce choix hybride répond aussi au risque R02 : le rythme court des sprints force des arbitrages réguliers plutôt qu'un conflit larvé.</w:t>
       </w:r>
     </w:p>
     <w:p>
@@ -5452,16 +5380,7 @@
           <w:sz w:val="22"/>
           <w:szCs w:val="22"/>
         </w:rPr>
-        <w:t xml:space="preserve"> </w:t>
-      </w:r>
-      <w:r>
-        <w:rPr>
-          <w:rFonts w:ascii="Calibri" w:eastAsia="Times New Roman" w:hAnsi="Calibri" w:cs="Calibri"/>
-          <w:color w:val="1A1A1A"/>
-          <w:sz w:val="22"/>
-          <w:szCs w:val="22"/>
-        </w:rPr>
-        <w:t>tableau agile partagé (type Jira/Trello) pour le backlog et les sprints ; tableau de bord KPI partagé pour le pilotage ; les deux accessibles à tous les rôles, y compris en lecture pour la direction.</w:t>
+        <w:t xml:space="preserve"> tableau agile partagé (type Jira/Trello) pour le backlog et les sprints ; tableau de bord KPI partagé pour le pilotage ; les deux accessibles à tous les rôles, y compris en lecture pour la direction.</w:t>
       </w:r>
     </w:p>
     <w:p>
@@ -5531,16 +5450,7 @@
           <w:sz w:val="22"/>
           <w:szCs w:val="22"/>
         </w:rPr>
-        <w:t xml:space="preserve"> </w:t>
-      </w:r>
-      <w:r>
-        <w:rPr>
-          <w:rFonts w:ascii="Calibri" w:eastAsia="Times New Roman" w:hAnsi="Calibri" w:cs="Calibri"/>
-          <w:color w:val="1A1A1A"/>
-          <w:sz w:val="22"/>
-          <w:szCs w:val="22"/>
-        </w:rPr>
-        <w:t>horaires de rituels compatibles avec les contraintes de chacun ; supports de réunion partagés à l'avance et accessibles (compatibles lecteur d'écran) ; tour de parole systématique en rétrospective ; charge de travail suivie en sprint planning ; retours du terrain traités via un canal structuré (B10).</w:t>
+        <w:t xml:space="preserve"> horaires de rituels compatibles avec les contraintes de chacun ; supports de réunion partagés à l'avance et accessibles (compatibles lecteur d'écran) ; tour de parole systématique en rétrospective ; charge de travail suivie en sprint planning ; retours du terrain traités via un canal structuré (B10).</w:t>
       </w:r>
     </w:p>
     <w:p>
@@ -7846,6 +7756,7 @@
           <w:sz w:val="22"/>
           <w:szCs w:val="22"/>
         </w:rPr>
+        <w:lastRenderedPageBreak/>
         <w:t>Lead Data Accountable sur la planification, les KPI et le reporting</w:t>
       </w:r>
       <w:r>
@@ -7855,16 +7766,7 @@
           <w:sz w:val="22"/>
           <w:szCs w:val="22"/>
         </w:rPr>
-        <w:t xml:space="preserve"> </w:t>
-      </w:r>
-      <w:r>
-        <w:rPr>
-          <w:rFonts w:ascii="Calibri" w:eastAsia="Times New Roman" w:hAnsi="Calibri" w:cs="Calibri"/>
-          <w:color w:val="1A1A1A"/>
-          <w:sz w:val="22"/>
-          <w:szCs w:val="22"/>
-        </w:rPr>
-        <w:t>: la direction a confié le pilotage du déploiement à l'équipe Data Engineering ; son responsable planifie, garantit la fiabilité des indicateurs (formule et owner par KPI — mitigation de R06, réponse au feedback F03) et rend compte.</w:t>
+        <w:t xml:space="preserve"> : la direction a confié le pilotage du déploiement à l'équipe Data Engineering ; son responsable planifie, garantit la fiabilité des indicateurs (formule et owner par KPI — mitigation de R06, réponse au feedback F03) et rend compte.</w:t>
       </w:r>
     </w:p>
     <w:p>
@@ -7934,16 +7836,7 @@
           <w:sz w:val="22"/>
           <w:szCs w:val="22"/>
         </w:rPr>
-        <w:t xml:space="preserve"> </w:t>
-      </w:r>
-      <w:r>
-        <w:rPr>
-          <w:rFonts w:ascii="Calibri" w:eastAsia="Times New Roman" w:hAnsi="Calibri" w:cs="Calibri"/>
-          <w:color w:val="1A1A1A"/>
-          <w:sz w:val="22"/>
-          <w:szCs w:val="22"/>
-        </w:rPr>
-        <w:t>: il connaît les profils utilisateurs et leurs contraintes (mitigation de R01) ; le support est Responsible sur la partie post-déploiement.</w:t>
+        <w:t xml:space="preserve"> : il connaît les profils utilisateurs et leurs contraintes (mitigation de R01) ; le support est Responsible sur la partie post-déploiement.</w:t>
       </w:r>
     </w:p>
     <w:p>
@@ -8645,16 +8538,7 @@
                 <w:sz w:val="18"/>
                 <w:szCs w:val="18"/>
               </w:rPr>
-              <w:t xml:space="preserve">Si adoption &lt; </w:t>
-            </w:r>
-            <w:r>
-              <w:rPr>
-                <w:rFonts w:ascii="Calibri" w:eastAsia="Times New Roman" w:hAnsi="Calibri" w:cs="Calibri"/>
-                <w:color w:val="1A1A1A"/>
-                <w:sz w:val="18"/>
-                <w:szCs w:val="18"/>
-              </w:rPr>
-              <w:t>50 % à S8 : ateliers ciblés supplémentaires, accompagnement individuel en binôme, simplification des écrans prioritaires</w:t>
+              <w:t>Si adoption &lt; 50 % à S8 : ateliers ciblés supplémentaires, accompagnement individuel en binôme, simplification des écrans prioritaires</w:t>
             </w:r>
           </w:p>
         </w:tc>
@@ -9772,6 +9656,7 @@
                 <w:sz w:val="18"/>
                 <w:szCs w:val="18"/>
               </w:rPr>
+              <w:lastRenderedPageBreak/>
               <w:t>R06</w:t>
             </w:r>
           </w:p>
@@ -10716,16 +10601,7 @@
                 <w:sz w:val="18"/>
                 <w:szCs w:val="18"/>
               </w:rPr>
-              <w:t xml:space="preserve">Si &lt; </w:t>
-            </w:r>
-            <w:r>
-              <w:rPr>
-                <w:rFonts w:ascii="Calibri" w:eastAsia="Times New Roman" w:hAnsi="Calibri" w:cs="Calibri"/>
-                <w:color w:val="1A1A1A"/>
-                <w:sz w:val="18"/>
-                <w:szCs w:val="18"/>
-              </w:rPr>
-              <w:t>50 % à S8 : ateliers ciblés, analyse des freins via le canal de feedback</w:t>
+              <w:t>Si &lt; 50 % à S8 : ateliers ciblés, analyse des freins via le canal de feedback</w:t>
             </w:r>
           </w:p>
         </w:tc>
@@ -12065,44 +11941,55 @@
                 <w:sz w:val="18"/>
                 <w:szCs w:val="18"/>
               </w:rPr>
-              <w:t>Score moyen recueilli après chaque atelier</w:t>
-            </w:r>
-          </w:p>
-        </w:tc>
-        <w:tc>
-          <w:tcPr>
-            <w:tcW w:w="0" w:type="auto"/>
-            <w:tcBorders>
-              <w:top w:val="single" w:sz="6" w:space="0" w:color="95A5A6"/>
-              <w:left w:val="single" w:sz="6" w:space="0" w:color="95A5A6"/>
-              <w:bottom w:val="single" w:sz="6" w:space="0" w:color="95A5A6"/>
-              <w:right w:val="single" w:sz="6" w:space="0" w:color="95A5A6"/>
-            </w:tcBorders>
-            <w:tcMar>
-              <w:top w:w="80" w:type="dxa"/>
-              <w:left w:w="80" w:type="dxa"/>
-              <w:bottom w:w="80" w:type="dxa"/>
-              <w:right w:w="80" w:type="dxa"/>
-            </w:tcMar>
-            <w:hideMark/>
-          </w:tcPr>
-          <w:p>
-            <w:pPr>
-              <w:spacing w:before="160" w:after="160"/>
-              <w:rPr>
-                <w:rFonts w:ascii="Calibri" w:eastAsia="Times New Roman" w:hAnsi="Calibri" w:cs="Calibri"/>
-                <w:color w:val="1A1A1A"/>
-                <w:sz w:val="18"/>
-                <w:szCs w:val="18"/>
-              </w:rPr>
-            </w:pPr>
-            <w:r>
-              <w:rPr>
-                <w:rFonts w:ascii="Calibri" w:eastAsia="Times New Roman" w:hAnsi="Calibri" w:cs="Calibri"/>
-                <w:color w:val="1A1A1A"/>
-                <w:sz w:val="18"/>
-                <w:szCs w:val="18"/>
-              </w:rPr>
+              <w:t xml:space="preserve">Score moyen recueilli </w:t>
+            </w:r>
+            <w:r>
+              <w:rPr>
+                <w:rFonts w:ascii="Calibri" w:eastAsia="Times New Roman" w:hAnsi="Calibri" w:cs="Calibri"/>
+                <w:color w:val="1A1A1A"/>
+                <w:sz w:val="18"/>
+                <w:szCs w:val="18"/>
+              </w:rPr>
+              <w:lastRenderedPageBreak/>
+              <w:t>après chaque atelier</w:t>
+            </w:r>
+          </w:p>
+        </w:tc>
+        <w:tc>
+          <w:tcPr>
+            <w:tcW w:w="0" w:type="auto"/>
+            <w:tcBorders>
+              <w:top w:val="single" w:sz="6" w:space="0" w:color="95A5A6"/>
+              <w:left w:val="single" w:sz="6" w:space="0" w:color="95A5A6"/>
+              <w:bottom w:val="single" w:sz="6" w:space="0" w:color="95A5A6"/>
+              <w:right w:val="single" w:sz="6" w:space="0" w:color="95A5A6"/>
+            </w:tcBorders>
+            <w:tcMar>
+              <w:top w:w="80" w:type="dxa"/>
+              <w:left w:w="80" w:type="dxa"/>
+              <w:bottom w:w="80" w:type="dxa"/>
+              <w:right w:w="80" w:type="dxa"/>
+            </w:tcMar>
+            <w:hideMark/>
+          </w:tcPr>
+          <w:p>
+            <w:pPr>
+              <w:spacing w:before="160" w:after="160"/>
+              <w:rPr>
+                <w:rFonts w:ascii="Calibri" w:eastAsia="Times New Roman" w:hAnsi="Calibri" w:cs="Calibri"/>
+                <w:color w:val="1A1A1A"/>
+                <w:sz w:val="18"/>
+                <w:szCs w:val="18"/>
+              </w:rPr>
+            </w:pPr>
+            <w:r>
+              <w:rPr>
+                <w:rFonts w:ascii="Calibri" w:eastAsia="Times New Roman" w:hAnsi="Calibri" w:cs="Calibri"/>
+                <w:color w:val="1A1A1A"/>
+                <w:sz w:val="18"/>
+                <w:szCs w:val="18"/>
+              </w:rPr>
+              <w:lastRenderedPageBreak/>
               <w:t>N/A</w:t>
             </w:r>
           </w:p>
@@ -12255,7 +12142,17 @@
                 <w:sz w:val="18"/>
                 <w:szCs w:val="18"/>
               </w:rPr>
-              <w:t>Refonte du format, sessions complémentaires courtes</w:t>
+              <w:t xml:space="preserve">Refonte du format, sessions </w:t>
+            </w:r>
+            <w:r>
+              <w:rPr>
+                <w:rFonts w:ascii="Calibri" w:eastAsia="Times New Roman" w:hAnsi="Calibri" w:cs="Calibri"/>
+                <w:color w:val="1A1A1A"/>
+                <w:sz w:val="18"/>
+                <w:szCs w:val="18"/>
+              </w:rPr>
+              <w:lastRenderedPageBreak/>
+              <w:t>complémentaires courtes</w:t>
             </w:r>
           </w:p>
         </w:tc>
@@ -12295,6 +12192,7 @@
                 <w:sz w:val="18"/>
                 <w:szCs w:val="18"/>
               </w:rPr>
+              <w:lastRenderedPageBreak/>
               <w:t>Empreinte numérique du projet</w:t>
             </w:r>
           </w:p>
@@ -12595,16 +12493,7 @@
           <w:sz w:val="22"/>
           <w:szCs w:val="22"/>
         </w:rPr>
-        <w:t xml:space="preserve"> </w:t>
-      </w:r>
-      <w:r>
-        <w:rPr>
-          <w:rFonts w:ascii="Calibri" w:hAnsi="Calibri" w:cs="Calibri"/>
-          <w:color w:val="1A1A1A"/>
-          <w:sz w:val="22"/>
-          <w:szCs w:val="22"/>
-        </w:rPr>
-        <w:t>les KPI sont revus au comité hebdomadaire (statut vert/orange/rouge) ; chaque dérive déclenche l'action définie et, si nécessaire, une entrée au backlog d'amélioration (section 9). Les rétrospectives de sprint alimentent l'amélioration du fonctionnement d'équipe.</w:t>
+        <w:t xml:space="preserve"> les KPI sont revus au comité hebdomadaire (statut vert/orange/rouge) ; chaque dérive déclenche l'action définie et, si nécessaire, une entrée au backlog d'amélioration (section 9). Les rétrospectives de sprint alimentent l'amélioration du fonctionnement d'équipe.</w:t>
       </w:r>
     </w:p>
     <w:p>
@@ -14346,7 +14235,7 @@
           <w:sz w:val="22"/>
           <w:szCs w:val="22"/>
         </w:rPr>
-        <w:t xml:space="preserve"> </w:t>
+        <w:t xml:space="preserve"> trois retours combinent impact élevé et fréquence élevée (F01, F03, F04) : ils sont traités en premier. F05 est remonté en priorité 2 malgré sa fréquence occasionnelle, car l'accessibilité est </w:t>
       </w:r>
       <w:r>
         <w:rPr>
@@ -14355,7 +14244,8 @@
           <w:sz w:val="22"/>
           <w:szCs w:val="22"/>
         </w:rPr>
-        <w:t>trois retours combinent impact élevé et fréquence élevée (F01, F03, F04) : ils sont traités en premier. F05 est remonté en priorité 2 malgré sa fréquence occasionnelle, car l'accessibilité est une exigence transverse du projet (R04) et une obligation d'inclusion. F02 et F06 sont absorbés par des chantiers déjà planifiés (reporting B02, indicateur RSE B08).</w:t>
+        <w:lastRenderedPageBreak/>
+        <w:t>une exigence transverse du projet (R04) et une obligation d'inclusion. F02 et F06 sont absorbés par des chantiers déjà planifiés (reporting B02, indicateur RSE B08).</w:t>
       </w:r>
     </w:p>
     <w:p>
@@ -14386,16 +14276,7 @@
           <w:sz w:val="22"/>
           <w:szCs w:val="22"/>
         </w:rPr>
-        <w:t xml:space="preserve"> </w:t>
-      </w:r>
-      <w:r>
-        <w:rPr>
-          <w:rFonts w:ascii="Calibri" w:hAnsi="Calibri" w:cs="Calibri"/>
-          <w:color w:val="1A1A1A"/>
-          <w:sz w:val="22"/>
-          <w:szCs w:val="22"/>
-        </w:rPr>
-        <w:t>proposées par le PO en comité d'arbitrage, éclairées par le Lead Data sur les complexités et dépendances techniques ; l'ordre des sprints du plan projet (section 3) reflète ces décisions.</w:t>
+        <w:t xml:space="preserve"> proposées par le PO en comité d'arbitrage, éclairées par le Lead Data sur les complexités et dépendances techniques ; l'ordre des sprints du plan projet (section 3) reflète ces décisions.</w:t>
       </w:r>
     </w:p>
     <w:p>
@@ -14600,16 +14481,7 @@
           <w:sz w:val="22"/>
           <w:szCs w:val="22"/>
         </w:rPr>
-        <w:t xml:space="preserve"> </w:t>
-      </w:r>
-      <w:r>
-        <w:rPr>
-          <w:rFonts w:ascii="Calibri" w:eastAsia="Times New Roman" w:hAnsi="Calibri" w:cs="Calibri"/>
-          <w:color w:val="1A1A1A"/>
-          <w:sz w:val="22"/>
-          <w:szCs w:val="22"/>
-        </w:rPr>
-        <w:t>valider le dispositif de formation par profils en formats courts et les exigences d'accessibilité des supports.</w:t>
+        <w:t xml:space="preserve"> valider le dispositif de formation par profils en formats courts et les exigences d'accessibilité des supports.</w:t>
       </w:r>
     </w:p>
     <w:p>

</xml_diff>